<commit_message>
Docs: farm visit charged separately; agreement contact details as placeholders
Setup is remote and includes no farm visit. A visit on request is charged at
the hourly rate for time at the farm, plus travel at AA km rates or actual
cost (flights, car hire, accommodation): clause 3.4, Schedule A and the
pricing table. The Provider's contact details are placeholders again.

Co-Authored-By: Claude Opus 5.5 <noreply@anthropic.com>
Claude-Session: https://claude.ai/code/session_01RGV8HHtZPxR5NvgfBiY8En
</commit_message>
<xml_diff>
--- a/docs/Plaashek_Service_Agreement.docx
+++ b/docs/Plaashek_Service_Agreement.docx
@@ -788,7 +788,7 @@
                 <w:sz w:val="19"/>
                 <w:szCs w:val="19"/>
               </w:rPr>
-              <w:t xml:space="preserve">Dawie Pieterse</w:t>
+              <w:t xml:space="preserve">[●]</w:t>
             </w:r>
           </w:p>
         </w:tc>
@@ -890,7 +890,7 @@
                 <w:sz w:val="19"/>
                 <w:szCs w:val="19"/>
               </w:rPr>
-              <w:t xml:space="preserve">dawie.pieterse@gmail.com</w:t>
+              <w:t xml:space="preserve">[●]</w:t>
             </w:r>
           </w:p>
         </w:tc>
@@ -992,7 +992,7 @@
                 <w:sz w:val="19"/>
                 <w:szCs w:val="19"/>
               </w:rPr>
-              <w:t xml:space="preserve">+27 83 456 5646 (also WhatsApp)</w:t>
+              <w:t xml:space="preserve">[●]</w:t>
             </w:r>
           </w:p>
         </w:tc>
@@ -1680,7 +1680,7 @@
           <w:sz w:val="21"/>
           <w:szCs w:val="21"/>
         </w:rPr>
-        <w:t xml:space="preserve">3.2	Services not described in this Agreement, such as custom development, data capture on the Farm's behalf, importing historical records, hardware supply or on-site visits beyond those included in Schedule A, are additional services, quoted separately and charged at the rates in Schedule A once accepted in writing.</w:t>
+        <w:t xml:space="preserve">3.2	Services not described in this Agreement, such as custom development, data capture on the Farm's behalf, importing historical records, hardware supply or farm visits (clause 3.4), are additional services, quoted separately and charged at the rates in Schedule A once accepted in writing.</w:t>
       </w:r>
     </w:p>
     <w:p>
@@ -1699,6 +1699,24 @@
           <w:szCs w:val="21"/>
         </w:rPr>
         <w:t xml:space="preserve">3.3	The Farm may add or remove paid Modules by written notice. An added Module is charged from the first day of the month in which it is switched on. A removed Module stops being charged from the end of the then-current billing period; its records stay part of the Farm Data. The Eienaar and Weather modules are free and always on.</w:t>
+      </w:r>
+    </w:p>
+    <w:p>
+      <w:pPr>
+        <w:tabs>
+          <w:tab w:val="left" w:pos="720"/>
+        </w:tabs>
+        <w:spacing w:after="100" w:line="276"/>
+        <w:ind w:left="720" w:hanging="720"/>
+        <w:jc w:val="both"/>
+      </w:pPr>
+      <w:r>
+        <w:rPr>
+          <w:rFonts w:ascii="Calibri" w:cs="Calibri" w:eastAsia="Calibri" w:hAnsi="Calibri"/>
+          <w:sz w:val="21"/>
+          <w:szCs w:val="21"/>
+        </w:rPr>
+        <w:t xml:space="preserve">3.4	Setup and support are given remotely; no farm visit is included in the Fees, including at setup. A farm visit the Farm asks for and accepts in writing is charged at the additional-services hourly rate in Schedule A for the time spent at the Farm, plus travel at the Automobile Association of South Africa (AA) rate per kilometre for the vehicle used, or at actual cost where travel needs flights, car hire or accommodation.</w:t>
       </w:r>
     </w:p>
     <w:p>
@@ -4685,7 +4703,7 @@
                 <w:sz w:val="19"/>
                 <w:szCs w:val="19"/>
               </w:rPr>
-              <w:t xml:space="preserve">The Farm's own installation and database on the Hosted Service, nightly backups, the office and field applications, Farm settings and the worker register with printed worker cards. Setup includes a farm visit, loading the Farm's camps and animals, and training.</w:t>
+              <w:t xml:space="preserve">The Farm's own installation and database on the Hosted Service, nightly backups, the office and field applications, Farm settings and the worker register with printed worker cards. Setup includes loading the Farm's camps and animals and remote training; a farm visit is charged separately (clause 3.4).</w:t>
             </w:r>
           </w:p>
         </w:tc>
@@ -7513,7 +7531,7 @@
                 <w:sz w:val="19"/>
                 <w:szCs w:val="19"/>
               </w:rPr>
-              <w:t xml:space="preserve">On-site visits included</w:t>
+              <w:t xml:space="preserve">Farm visits included</w:t>
             </w:r>
           </w:p>
         </w:tc>
@@ -7545,7 +7563,7 @@
                 <w:sz w:val="19"/>
                 <w:szCs w:val="19"/>
               </w:rPr>
-              <w:t xml:space="preserve">1 (one) farm visit at setup</w:t>
+              <w:t xml:space="preserve">None (clause 3.4)</w:t>
             </w:r>
           </w:p>
         </w:tc>
@@ -7653,7 +7671,7 @@
                 <w:sz w:val="19"/>
                 <w:szCs w:val="19"/>
               </w:rPr>
-              <w:t xml:space="preserve">Additional services (remote), per hour</w:t>
+              <w:t xml:space="preserve">Additional services, per hour</w:t>
             </w:r>
           </w:p>
         </w:tc>
@@ -7723,7 +7741,7 @@
                 <w:sz w:val="19"/>
                 <w:szCs w:val="19"/>
               </w:rPr>
-              <w:t xml:space="preserve">On-site call-out, per visit plus travel at R [●]/km</w:t>
+              <w:t xml:space="preserve">Farm visit, on request (clause 3.4)</w:t>
             </w:r>
           </w:p>
         </w:tc>
@@ -7755,7 +7773,7 @@
                 <w:sz w:val="19"/>
                 <w:szCs w:val="19"/>
               </w:rPr>
-              <w:t xml:space="preserve">R [●] excl. VAT</w:t>
+              <w:t xml:space="preserve">Hourly rate above for time at the Farm, plus travel at the AA rate per km, or actual cost of flights, car hire and accommodation</w:t>
             </w:r>
           </w:p>
         </w:tc>
@@ -8572,7 +8590,7 @@
           <w:sz w:val="21"/>
           <w:szCs w:val="21"/>
         </w:rPr>
-        <w:t xml:space="preserve">B1	Support channels: WhatsApp or phone +27 83 456 5646, email dawie.pieterse@gmail.com. P1 issues must be reported by phone or WhatsApp. Support is given by the person who built the Software.</w:t>
+        <w:t xml:space="preserve">B1	Support channels: [WhatsApp / phone number], [email address]. P1 issues must be reported by phone or WhatsApp. Support is given by the person who built the Software.</w:t>
       </w:r>
     </w:p>
     <w:p>

</xml_diff>